<commit_message>
Padroniza campos de hora no formato oficial XXhXXmin (automatizado)
- redacao.formatar_hora_br: normaliza qualquer entrada ("8", "8:30", "1502",
  "08h30min"...) para o padrão da PMMG "XXhXXmin" em texto corrido.
- Normalização central em modelo_documentos._gerar: todos os campos de hora
  (fato, oitiva, depoimento, reunião do CEDMU) saem formatados, independente
  de como foram digitados.
- Templates .docx editados para deixar o campo de hora ISOLADO, removendo os
  sufixos fixos inconsistentes (" horas", "h00min") que faziam o minuto real
  se perder ou duplicar o texto.
- Formulário web: campos de hora viram <input type="time"> (seletor HH:MM),
  fácil para o usuário; conversão automática HH:MM <-> XXhXXmin.
- Exemplo regenerado mostrando os novos horários (08h20min, 14h40min etc.).

Co-Authored-By: Claude Opus 4.8 <noreply@anthropic.com>
</commit_message>
<xml_diff>
--- a/pcd_automation/pcd_automation/modelo_documentos/templates/despacho_instauracao.docx
+++ b/pcd_automation/pcd_automation/modelo_documentos/templates/despacho_instauracao.docx
@@ -595,7 +595,7 @@
           <w:vertAlign w:val="baseline"/>
           <w:rtl w:val="0"/>
         </w:rPr>
-        <w:t xml:space="preserve"> horas, teria o comunicado </w:t>
+        <w:t xml:space="preserve">, teria o comunicado </w:t>
       </w:r>
       <w:r>
         <w:rPr>
@@ -913,12 +913,35 @@
     </w:p>
     <w:sectPr>
       <w:headerReference r:id="rId8" w:type="default"/>
+      <w:footerReference w:type="default" r:id="rId9"/>
+      <w:headerReference w:type="first" r:id="rId10"/>
+      <w:footerReference w:type="first" r:id="rId11"/>
       <w:pgSz w:h="16838" w:w="11906" w:orient="portrait"/>
       <w:pgMar w:bottom="1417" w:top="1417" w:left="1701" w:right="1701" w:header="708" w:footer="708"/>
       <w:pgNumType w:start="1"/>
     </w:sectPr>
   </w:body>
 </w:document>
+</file>
+
+<file path=word/footer1.xml><?xml version="1.0" encoding="utf-8"?>
+<w:ftr xmlns:m="http://schemas.openxmlformats.org/officeDocument/2006/math" xmlns:mc="http://schemas.openxmlformats.org/markup-compatibility/2006" xmlns:mo="http://schemas.microsoft.com/office/mac/office/2008/main" xmlns:mv="urn:schemas-microsoft-com:mac:vml" xmlns:o="urn:schemas-microsoft-com:office:office" xmlns:r="http://schemas.openxmlformats.org/officeDocument/2006/relationships" xmlns:v="urn:schemas-microsoft-com:vml" xmlns:w10="urn:schemas-microsoft-com:office:word" xmlns:w14="http://schemas.microsoft.com/office/word/2010/wordml" xmlns:w="http://schemas.openxmlformats.org/wordprocessingml/2006/main" xmlns:wne="http://schemas.microsoft.com/office/word/2006/wordml" xmlns:wp14="http://schemas.microsoft.com/office/word/2010/wordprocessingDrawing" xmlns:wp="http://schemas.openxmlformats.org/drawingml/2006/wordprocessingDrawing" xmlns:wpc="http://schemas.microsoft.com/office/word/2010/wordprocessingCanvas" xmlns:wpg="http://schemas.microsoft.com/office/word/2010/wordprocessingGroup" xmlns:wpi="http://schemas.microsoft.com/office/word/2010/wordprocessingInk" xmlns:wps="http://schemas.microsoft.com/office/word/2010/wordprocessingShape" mc:Ignorable="w14 wp14">
+  <w:p>
+    <w:pPr>
+      <w:pStyle w:val="Footer"/>
+    </w:pPr>
+  </w:p>
+</w:ftr>
+</file>
+
+<file path=word/footer2.xml><?xml version="1.0" encoding="utf-8"?>
+<w:ftr xmlns:m="http://schemas.openxmlformats.org/officeDocument/2006/math" xmlns:mc="http://schemas.openxmlformats.org/markup-compatibility/2006" xmlns:mo="http://schemas.microsoft.com/office/mac/office/2008/main" xmlns:mv="urn:schemas-microsoft-com:mac:vml" xmlns:o="urn:schemas-microsoft-com:office:office" xmlns:r="http://schemas.openxmlformats.org/officeDocument/2006/relationships" xmlns:v="urn:schemas-microsoft-com:vml" xmlns:w10="urn:schemas-microsoft-com:office:word" xmlns:w14="http://schemas.microsoft.com/office/word/2010/wordml" xmlns:w="http://schemas.openxmlformats.org/wordprocessingml/2006/main" xmlns:wne="http://schemas.microsoft.com/office/word/2006/wordml" xmlns:wp14="http://schemas.microsoft.com/office/word/2010/wordprocessingDrawing" xmlns:wp="http://schemas.openxmlformats.org/drawingml/2006/wordprocessingDrawing" xmlns:wpc="http://schemas.microsoft.com/office/word/2010/wordprocessingCanvas" xmlns:wpg="http://schemas.microsoft.com/office/word/2010/wordprocessingGroup" xmlns:wpi="http://schemas.microsoft.com/office/word/2010/wordprocessingInk" xmlns:wps="http://schemas.microsoft.com/office/word/2010/wordprocessingShape" mc:Ignorable="w14 wp14">
+  <w:p>
+    <w:pPr>
+      <w:pStyle w:val="Footer"/>
+    </w:pPr>
+  </w:p>
+</w:ftr>
 </file>
 
 <file path=word/header1.xml><?xml version="1.0" encoding="utf-8"?>
@@ -1007,6 +1030,16 @@
         </wp:anchor>
       </w:drawing>
     </w:r>
+  </w:p>
+</w:hdr>
+</file>
+
+<file path=word/header2.xml><?xml version="1.0" encoding="utf-8"?>
+<w:hdr xmlns:m="http://schemas.openxmlformats.org/officeDocument/2006/math" xmlns:mc="http://schemas.openxmlformats.org/markup-compatibility/2006" xmlns:mo="http://schemas.microsoft.com/office/mac/office/2008/main" xmlns:mv="urn:schemas-microsoft-com:mac:vml" xmlns:o="urn:schemas-microsoft-com:office:office" xmlns:r="http://schemas.openxmlformats.org/officeDocument/2006/relationships" xmlns:v="urn:schemas-microsoft-com:vml" xmlns:w10="urn:schemas-microsoft-com:office:word" xmlns:w14="http://schemas.microsoft.com/office/word/2010/wordml" xmlns:w="http://schemas.openxmlformats.org/wordprocessingml/2006/main" xmlns:wne="http://schemas.microsoft.com/office/word/2006/wordml" xmlns:wp14="http://schemas.microsoft.com/office/word/2010/wordprocessingDrawing" xmlns:wp="http://schemas.openxmlformats.org/drawingml/2006/wordprocessingDrawing" xmlns:wpc="http://schemas.microsoft.com/office/word/2010/wordprocessingCanvas" xmlns:wpg="http://schemas.microsoft.com/office/word/2010/wordprocessingGroup" xmlns:wpi="http://schemas.microsoft.com/office/word/2010/wordprocessingInk" xmlns:wps="http://schemas.microsoft.com/office/word/2010/wordprocessingShape" mc:Ignorable="w14 wp14">
+  <w:p>
+    <w:pPr>
+      <w:pStyle w:val="Header"/>
+    </w:pPr>
   </w:p>
 </w:hdr>
 </file>

</xml_diff>